<commit_message>
Durcir les références bibliographiques Word
</commit_message>
<xml_diff>
--- a/tests/fixtures/docx/native-bibliographic-references.docx
+++ b/tests/fixtures/docx/native-bibliographic-references.docx
@@ -1,6 +1,6 @@
 
 <file path=word/document.xml><?xml version="1.0" encoding="utf-8"?>
-<w:document xmlns:w="http://schemas.openxmlformats.org/wordprocessingml/2006/main">
+<w:document xmlns:w="http://schemas.openxmlformats.org/wordprocessingml/2006/main" xmlns:r="http://schemas.openxmlformats.org/officeDocument/2006/relationships" xmlns:wp="http://schemas.openxmlformats.org/drawingml/2006/wordprocessingDrawing" xmlns:a="http://schemas.openxmlformats.org/drawingml/2006/main" xmlns:pic="http://schemas.openxmlformats.org/drawingml/2006/picture">
   <w:body>
     <w:p>
       <w:pPr>
@@ -20,6 +20,14 @@
     </w:p>
     <w:p>
       <w:pPr>
+        <w:pStyle w:val="Heading1"/>
+      </w:pPr>
+      <w:r>
+        <w:t>Chapitre bibliographique</w:t>
+      </w:r>
+    </w:p>
+    <w:p>
+      <w:pPr>
         <w:pStyle w:val="Normal"/>
       </w:pPr>
       <w:r>
@@ -29,10 +37,31 @@
         <w:rPr>
           <w:rStyle w:val="TEIbiblreference-inline"/>
         </w:rPr>
-        <w:t>Dupont, 2024</w:t>
-      </w:r>
+        <w:t>Dupont, </w:t>
+      </w:r>
+      <w:r>
+        <w:rPr>
+          <w:rStyle w:val="TEIbiblreference-inline"/>
+          <w:b/>
+          <w:i/>
+          <w:smallCaps/>
+          <w:vertAlign w:val="superscript"/>
+        </w:rPr>
+        <w:t>2024</w:t>
+      </w:r>
+      <w:hyperlink r:id="rIdHyper">
+        <w:r>
+          <w:rPr>
+            <w:rStyle w:val="TEIbiblreference-inline"/>
+          </w:rPr>
+          <w:t> lien</w:t>
+        </w:r>
+      </w:hyperlink>
       <w:r>
         <w:t>.</w:t>
+      </w:r>
+      <w:r>
+        <w:footnoteReference w:id="1"/>
       </w:r>
     </w:p>
     <w:p>
@@ -80,6 +109,112 @@
     <w:p>
       <w:pPr>
         <w:pStyle w:val="Normal"/>
+        <w:numPr>
+          <w:ilvl w:val="0"/>
+          <w:numId w:val="42"/>
+        </w:numPr>
+      </w:pPr>
+      <w:r>
+        <w:t>Item avec </w:t>
+      </w:r>
+      <w:r>
+        <w:rPr>
+          <w:rStyle w:val="TEIbiblreference-inline"/>
+        </w:rPr>
+        <w:t>reference de liste</w:t>
+      </w:r>
+    </w:p>
+    <w:p>
+      <w:pPr>
+        <w:pStyle w:val="ListParagraph"/>
+      </w:pPr>
+      <w:r>
+        <w:t>Suite avec </w:t>
+      </w:r>
+      <w:r>
+        <w:rPr>
+          <w:rStyle w:val="TEIbiblreference-inline"/>
+        </w:rPr>
+        <w:t>reference de continuation</w:t>
+      </w:r>
+    </w:p>
+    <w:p>
+      <w:pPr>
+        <w:pStyle w:val="Normal"/>
+        <w:numPr>
+          <w:ilvl w:val="0"/>
+          <w:numId w:val="42"/>
+        </w:numPr>
+      </w:pPr>
+      <w:r>
+        <w:t>Item suivant.</w:t>
+      </w:r>
+    </w:p>
+    <w:tbl>
+      <w:tblGrid>
+        <w:gridCol/>
+      </w:tblGrid>
+      <w:tr>
+        <w:tc>
+          <w:p>
+            <w:pPr>
+              <w:pStyle w:val="Normal"/>
+            </w:pPr>
+            <w:r>
+              <w:t>Cellule avec </w:t>
+            </w:r>
+            <w:r>
+              <w:rPr>
+                <w:rStyle w:val="TEIbiblreference-inline"/>
+              </w:rPr>
+              <w:t>reference de table</w:t>
+            </w:r>
+          </w:p>
+        </w:tc>
+      </w:tr>
+    </w:tbl>
+    <w:p>
+      <w:pPr>
+        <w:pStyle w:val="Normal"/>
+      </w:pPr>
+      <w:r>
+        <w:drawing>
+          <wp:inline>
+            <wp:extent cx="914400" cy="914400"/>
+            <wp:docPr id="41" name="Picture bibliographie" descr="Description bibliographique de figure." title="Titre Word ignore"/>
+            <a:graphic>
+              <a:graphicData uri="http://schemas.openxmlformats.org/drawingml/2006/picture">
+                <pic:pic>
+                  <pic:blipFill>
+                    <a:blip r:embed="rIdPng"/>
+                  </pic:blipFill>
+                  <pic:spPr>
+                    <a:xfrm/>
+                  </pic:spPr>
+                </pic:pic>
+              </a:graphicData>
+            </a:graphic>
+          </wp:inline>
+        </w:drawing>
+      </w:r>
+    </w:p>
+    <w:p>
+      <w:pPr>
+        <w:pStyle w:val="Caption"/>
+      </w:pPr>
+      <w:r>
+        <w:t>Legende avec </w:t>
+      </w:r>
+      <w:r>
+        <w:rPr>
+          <w:rStyle w:val="TEIbiblreference-inline"/>
+        </w:rPr>
+        <w:t>reference de legende</w:t>
+      </w:r>
+    </w:p>
+    <w:p>
+      <w:pPr>
+        <w:pStyle w:val="Normal"/>
       </w:pPr>
       <w:r>
         <w:t>Transition.</w:t>
@@ -131,6 +266,78 @@
     <w:sectPr/>
   </w:body>
 </w:document>
+</file>
+
+<file path=word/footnotes.xml><?xml version="1.0" encoding="utf-8"?>
+<w:footnotes xmlns:w="http://schemas.openxmlformats.org/wordprocessingml/2006/main">
+  <w:footnote w:id="-1" w:type="separator">
+    <w:p>
+      <w:r>
+        <w:separator/>
+      </w:r>
+    </w:p>
+  </w:footnote>
+  <w:footnote w:id="1">
+    <w:p>
+      <w:pPr>
+        <w:pStyle w:val="FootnoteText"/>
+      </w:pPr>
+      <w:r>
+        <w:t>Note avec </w:t>
+      </w:r>
+      <w:r>
+        <w:rPr>
+          <w:rStyle w:val="TEIbiblreference-inline"/>
+        </w:rPr>
+        <w:t>reference de note</w:t>
+      </w:r>
+    </w:p>
+  </w:footnote>
+</w:footnotes>
+</file>
+
+<file path=word/numbering.xml><?xml version="1.0" encoding="utf-8"?>
+<w:numbering xmlns:w="http://schemas.openxmlformats.org/wordprocessingml/2006/main">
+  <w:abstractNum w:abstractNumId="10">
+    <w:multiLevelType w:val="multilevel"/>
+    <w:name w:val="Synthétique"/>
+    <w:lvl w:ilvl="0">
+      <w:start w:val="1"/>
+      <w:numFmt w:val="decimal"/>
+      <w:lvlText w:val="%1."/>
+      <w:suff w:val="space"/>
+    </w:lvl>
+    <w:lvl w:ilvl="1">
+      <w:start w:val="1"/>
+      <w:numFmt w:val="bullet"/>
+      <w:lvlText w:val="•"/>
+      <w:suff w:val="tab"/>
+    </w:lvl>
+    <w:lvl w:ilvl="2">
+      <w:start w:val="1"/>
+      <w:numFmt w:val="lowerLetter"/>
+      <w:lvlText w:val="%3)"/>
+    </w:lvl>
+  </w:abstractNum>
+  <w:num w:numId="42">
+    <w:abstractNumId w:val="10"/>
+  </w:num>
+  <w:num w:numId="43">
+    <w:abstractNumId w:val="10"/>
+    <w:lvlOverride w:ilvl="0">
+      <w:startOverride w:val="5"/>
+    </w:lvlOverride>
+  </w:num>
+  <w:num w:numId="44">
+    <w:abstractNumId w:val="10"/>
+  </w:num>
+  <w:num w:numId="45">
+    <w:abstractNumId w:val="10"/>
+  </w:num>
+  <w:num w:numId="46">
+    <w:abstractNumId w:val="10"/>
+  </w:num>
+</w:numbering>
 </file>
 
 <file path=word/styles.xml><?xml version="1.0" encoding="utf-8"?>

</xml_diff>